<commit_message>
Mémoire v3 : photos réelles, visuel INTERFAST officiel, mise en page continue
- Photos avant/après des vrais chantiers ADOM SENIOR (3 paires + finition bois)
- Visuel officiel du portail INTERFAST extrait du premier mémoire ADOM
- Mise en page continue sans sauts de page systématiques (23 pages denses,
  titres keepNext, chips en runs ombrés)
- Analyse d'écart complète vs mémoire technique ASH ajoutée à la note

Co-Authored-By: Claude Fable 5 <noreply@anthropic.com>
Claude-Session: https://claude.ai/code/session_01K5LwA8NCS9B4vD9dp2U7H2
</commit_message>
<xml_diff>
--- a/documents/PROPOSITION_REPRISE_MARCHE_ASH_MORBIHAN_HABITAT.docx
+++ b/documents/PROPOSITION_REPRISE_MARCHE_ASH_MORBIHAN_HABITAT.docx
@@ -460,49 +460,24 @@
         <w:br w:type="page"/>
       </w:r>
     </w:p>
-    <w:tbl>
-      <w:tblPr>
-        <w:tblW w:type="dxa" w:w="3600"/>
-        <w:tblBorders>
-          <w:top w:val="none" w:color="FFFFFF" w:sz="0"/>
-          <w:left w:val="none" w:color="FFFFFF" w:sz="0"/>
-          <w:bottom w:val="none" w:color="FFFFFF" w:sz="0"/>
-          <w:right w:val="none" w:color="FFFFFF" w:sz="0"/>
-          <w:insideH w:val="none" w:color="FFFFFF" w:sz="0"/>
-          <w:insideV w:val="none" w:color="FFFFFF" w:sz="0"/>
-        </w:tblBorders>
-      </w:tblPr>
-      <w:tblGrid>
-        <w:gridCol w:w="3600"/>
-      </w:tblGrid>
-      <w:tr>
-        <w:tc>
-          <w:tcPr>
-            <w:tcW w:type="dxa" w:w="3600"/>
-            <w:shd w:fill="DB982D" w:val="clear"/>
-            <w:tcMar>
-              <w:top w:type="dxa" w:w="60"/>
-              <w:left w:type="dxa" w:w="100"/>
-              <w:bottom w:type="dxa" w:w="60"/>
-              <w:right w:type="dxa" w:w="100"/>
-            </w:tcMar>
-          </w:tcPr>
-          <w:p>
-            <w:r>
-              <w:rPr>
-                <w:rFonts w:ascii="Arial" w:cs="Arial" w:eastAsia="Arial" w:hAnsi="Arial"/>
-                <w:b/>
-                <w:bCs/>
-                <w:color w:val="FFFFFF"/>
-                <w:sz w:val="16"/>
-                <w:szCs w:val="16"/>
-              </w:rPr>
-              <w:t xml:space="preserve">QUI SOMMES-NOUS ?</w:t>
-            </w:r>
-          </w:p>
-        </w:tc>
-      </w:tr>
-    </w:tbl>
+    <w:p>
+      <w:pPr>
+        <w:keepNext/>
+        <w:spacing w:after="80" w:before="240"/>
+      </w:pPr>
+      <w:r>
+        <w:rPr>
+          <w:rFonts w:ascii="Arial" w:cs="Arial" w:eastAsia="Arial" w:hAnsi="Arial"/>
+          <w:b/>
+          <w:bCs/>
+          <w:color w:val="FFFFFF"/>
+          <w:sz w:val="16"/>
+          <w:szCs w:val="16"/>
+          <w:shd w:fill="DB982D" w:val="clear"/>
+        </w:rPr>
+        <w:t xml:space="preserve">  QUI SOMMES-NOUS ?  </w:t>
+      </w:r>
+    </w:p>
     <w:p>
       <w:pPr>
         <w:spacing w:after="60"/>
@@ -511,6 +486,7 @@
     <w:p>
       <w:pPr>
         <w:pStyle w:val="Heading1"/>
+        <w:keepNext/>
         <w:spacing w:after="120" w:before="120"/>
       </w:pPr>
       <w:r>
@@ -1208,6 +1184,7 @@
     <w:p>
       <w:pPr>
         <w:pStyle w:val="Heading2"/>
+        <w:keepNext/>
         <w:spacing w:after="100" w:before="200"/>
       </w:pPr>
       <w:r>
@@ -1242,49 +1219,24 @@
         <w:br w:type="page"/>
       </w:r>
     </w:p>
-    <w:tbl>
-      <w:tblPr>
-        <w:tblW w:type="dxa" w:w="3600"/>
-        <w:tblBorders>
-          <w:top w:val="none" w:color="FFFFFF" w:sz="0"/>
-          <w:left w:val="none" w:color="FFFFFF" w:sz="0"/>
-          <w:bottom w:val="none" w:color="FFFFFF" w:sz="0"/>
-          <w:right w:val="none" w:color="FFFFFF" w:sz="0"/>
-          <w:insideH w:val="none" w:color="FFFFFF" w:sz="0"/>
-          <w:insideV w:val="none" w:color="FFFFFF" w:sz="0"/>
-        </w:tblBorders>
-      </w:tblPr>
-      <w:tblGrid>
-        <w:gridCol w:w="3600"/>
-      </w:tblGrid>
-      <w:tr>
-        <w:tc>
-          <w:tcPr>
-            <w:tcW w:type="dxa" w:w="3600"/>
-            <w:shd w:fill="DB982D" w:val="clear"/>
-            <w:tcMar>
-              <w:top w:type="dxa" w:w="60"/>
-              <w:left w:type="dxa" w:w="100"/>
-              <w:bottom w:type="dxa" w:w="60"/>
-              <w:right w:type="dxa" w:w="100"/>
-            </w:tcMar>
-          </w:tcPr>
-          <w:p>
-            <w:r>
-              <w:rPr>
-                <w:rFonts w:ascii="Arial" w:cs="Arial" w:eastAsia="Arial" w:hAnsi="Arial"/>
-                <w:b/>
-                <w:bCs/>
-                <w:color w:val="FFFFFF"/>
-                <w:sz w:val="16"/>
-                <w:szCs w:val="16"/>
-              </w:rPr>
-              <w:t xml:space="preserve">REPRISE ASH</w:t>
-            </w:r>
-          </w:p>
-        </w:tc>
-      </w:tr>
-    </w:tbl>
+    <w:p>
+      <w:pPr>
+        <w:keepNext/>
+        <w:spacing w:after="80" w:before="240"/>
+      </w:pPr>
+      <w:r>
+        <w:rPr>
+          <w:rFonts w:ascii="Arial" w:cs="Arial" w:eastAsia="Arial" w:hAnsi="Arial"/>
+          <w:b/>
+          <w:bCs/>
+          <w:color w:val="FFFFFF"/>
+          <w:sz w:val="16"/>
+          <w:szCs w:val="16"/>
+          <w:shd w:fill="DB982D" w:val="clear"/>
+        </w:rPr>
+        <w:t xml:space="preserve">  REPRISE ASH  </w:t>
+      </w:r>
+    </w:p>
     <w:p>
       <w:pPr>
         <w:spacing w:after="60"/>
@@ -1293,6 +1245,7 @@
     <w:p>
       <w:pPr>
         <w:pStyle w:val="Heading1"/>
+        <w:keepNext/>
         <w:spacing w:after="120" w:before="120"/>
       </w:pPr>
       <w:r>
@@ -1708,6 +1661,7 @@
     <w:p>
       <w:pPr>
         <w:pStyle w:val="Heading2"/>
+        <w:keepNext/>
         <w:spacing w:after="100" w:before="200"/>
       </w:pPr>
       <w:r>
@@ -2039,49 +1993,24 @@
         <w:br w:type="page"/>
       </w:r>
     </w:p>
-    <w:tbl>
-      <w:tblPr>
-        <w:tblW w:type="dxa" w:w="3600"/>
-        <w:tblBorders>
-          <w:top w:val="none" w:color="FFFFFF" w:sz="0"/>
-          <w:left w:val="none" w:color="FFFFFF" w:sz="0"/>
-          <w:bottom w:val="none" w:color="FFFFFF" w:sz="0"/>
-          <w:right w:val="none" w:color="FFFFFF" w:sz="0"/>
-          <w:insideH w:val="none" w:color="FFFFFF" w:sz="0"/>
-          <w:insideV w:val="none" w:color="FFFFFF" w:sz="0"/>
-        </w:tblBorders>
-      </w:tblPr>
-      <w:tblGrid>
-        <w:gridCol w:w="3600"/>
-      </w:tblGrid>
-      <w:tr>
-        <w:tc>
-          <w:tcPr>
-            <w:tcW w:type="dxa" w:w="3600"/>
-            <w:shd w:fill="DB982D" w:val="clear"/>
-            <w:tcMar>
-              <w:top w:type="dxa" w:w="60"/>
-              <w:left w:type="dxa" w:w="100"/>
-              <w:bottom w:type="dxa" w:w="60"/>
-              <w:right w:type="dxa" w:w="100"/>
-            </w:tcMar>
-          </w:tcPr>
-          <w:p>
-            <w:r>
-              <w:rPr>
-                <w:rFonts w:ascii="Arial" w:cs="Arial" w:eastAsia="Arial" w:hAnsi="Arial"/>
-                <w:b/>
-                <w:bCs/>
-                <w:color w:val="FFFFFF"/>
-                <w:sz w:val="16"/>
-                <w:szCs w:val="16"/>
-              </w:rPr>
-              <w:t xml:space="preserve">NOS CHIFFRES</w:t>
-            </w:r>
-          </w:p>
-        </w:tc>
-      </w:tr>
-    </w:tbl>
+    <w:p>
+      <w:pPr>
+        <w:keepNext/>
+        <w:spacing w:after="80" w:before="240"/>
+      </w:pPr>
+      <w:r>
+        <w:rPr>
+          <w:rFonts w:ascii="Arial" w:cs="Arial" w:eastAsia="Arial" w:hAnsi="Arial"/>
+          <w:b/>
+          <w:bCs/>
+          <w:color w:val="FFFFFF"/>
+          <w:sz w:val="16"/>
+          <w:szCs w:val="16"/>
+          <w:shd w:fill="DB982D" w:val="clear"/>
+        </w:rPr>
+        <w:t xml:space="preserve">  NOS CHIFFRES  </w:t>
+      </w:r>
+    </w:p>
     <w:p>
       <w:pPr>
         <w:spacing w:after="60"/>
@@ -2090,6 +2019,7 @@
     <w:p>
       <w:pPr>
         <w:pStyle w:val="Heading1"/>
+        <w:keepNext/>
         <w:spacing w:after="120" w:before="120"/>
       </w:pPr>
       <w:r>
@@ -2372,6 +2302,7 @@
     <w:p>
       <w:pPr>
         <w:pStyle w:val="Heading2"/>
+        <w:keepNext/>
         <w:spacing w:after="100" w:before="200"/>
       </w:pPr>
       <w:r>
@@ -2471,49 +2402,24 @@
         <w:br w:type="page"/>
       </w:r>
     </w:p>
-    <w:tbl>
-      <w:tblPr>
-        <w:tblW w:type="dxa" w:w="3600"/>
-        <w:tblBorders>
-          <w:top w:val="none" w:color="FFFFFF" w:sz="0"/>
-          <w:left w:val="none" w:color="FFFFFF" w:sz="0"/>
-          <w:bottom w:val="none" w:color="FFFFFF" w:sz="0"/>
-          <w:right w:val="none" w:color="FFFFFF" w:sz="0"/>
-          <w:insideH w:val="none" w:color="FFFFFF" w:sz="0"/>
-          <w:insideV w:val="none" w:color="FFFFFF" w:sz="0"/>
-        </w:tblBorders>
-      </w:tblPr>
-      <w:tblGrid>
-        <w:gridCol w:w="3600"/>
-      </w:tblGrid>
-      <w:tr>
-        <w:tc>
-          <w:tcPr>
-            <w:tcW w:type="dxa" w:w="3600"/>
-            <w:shd w:fill="DB982D" w:val="clear"/>
-            <w:tcMar>
-              <w:top w:type="dxa" w:w="60"/>
-              <w:left w:type="dxa" w:w="100"/>
-              <w:bottom w:type="dxa" w:w="60"/>
-              <w:right w:type="dxa" w:w="100"/>
-            </w:tcMar>
-          </w:tcPr>
-          <w:p>
-            <w:r>
-              <w:rPr>
-                <w:rFonts w:ascii="Arial" w:cs="Arial" w:eastAsia="Arial" w:hAnsi="Arial"/>
-                <w:b/>
-                <w:bCs/>
-                <w:color w:val="FFFFFF"/>
-                <w:sz w:val="16"/>
-                <w:szCs w:val="16"/>
-              </w:rPr>
-              <w:t xml:space="preserve">CADRE DE LA REPRISE</w:t>
-            </w:r>
-          </w:p>
-        </w:tc>
-      </w:tr>
-    </w:tbl>
+    <w:p>
+      <w:pPr>
+        <w:keepNext/>
+        <w:spacing w:after="80" w:before="240"/>
+      </w:pPr>
+      <w:r>
+        <w:rPr>
+          <w:rFonts w:ascii="Arial" w:cs="Arial" w:eastAsia="Arial" w:hAnsi="Arial"/>
+          <w:b/>
+          <w:bCs/>
+          <w:color w:val="FFFFFF"/>
+          <w:sz w:val="16"/>
+          <w:szCs w:val="16"/>
+          <w:shd w:fill="DB982D" w:val="clear"/>
+        </w:rPr>
+        <w:t xml:space="preserve">  CADRE DE LA REPRISE  </w:t>
+      </w:r>
+    </w:p>
     <w:p>
       <w:pPr>
         <w:spacing w:after="60"/>
@@ -2522,6 +2428,7 @@
     <w:p>
       <w:pPr>
         <w:pStyle w:val="Heading1"/>
+        <w:keepNext/>
         <w:spacing w:after="120" w:before="120"/>
       </w:pPr>
       <w:r>
@@ -3048,6 +2955,7 @@
     <w:p>
       <w:pPr>
         <w:pStyle w:val="Heading1"/>
+        <w:keepNext/>
         <w:spacing w:after="120" w:before="120"/>
       </w:pPr>
       <w:r>
@@ -3069,7 +2977,7 @@
           <w:ilvl w:val="0"/>
           <w:numId w:val="3"/>
         </w:numPr>
-        <w:spacing w:after="60" w:line="252"/>
+        <w:spacing w:after="30" w:line="252"/>
         <w:jc w:val="both"/>
       </w:pPr>
       <w:r>
@@ -3089,7 +2997,7 @@
           <w:ilvl w:val="0"/>
           <w:numId w:val="3"/>
         </w:numPr>
-        <w:spacing w:after="60" w:line="252"/>
+        <w:spacing w:after="30" w:line="252"/>
         <w:jc w:val="both"/>
       </w:pPr>
       <w:r>
@@ -3109,7 +3017,7 @@
           <w:ilvl w:val="0"/>
           <w:numId w:val="3"/>
         </w:numPr>
-        <w:spacing w:after="60" w:line="252"/>
+        <w:spacing w:after="30" w:line="252"/>
         <w:jc w:val="both"/>
       </w:pPr>
       <w:r>
@@ -3129,7 +3037,7 @@
           <w:ilvl w:val="0"/>
           <w:numId w:val="3"/>
         </w:numPr>
-        <w:spacing w:after="60" w:line="252"/>
+        <w:spacing w:after="30" w:line="252"/>
         <w:jc w:val="both"/>
       </w:pPr>
       <w:r>

</xml_diff>